<commit_message>
Add TTR review-meeting goal as a standing rule in the Words MasterList
Document the conditional goal (area 0 - Client framing & scope) in the JSON and
docx: when a TTR strategy is triggered from the advice request for an existing
client on a retirement SOA, this goal is auto-added to the Goals & Objectives
section. Generator wiring to inject it is pending a design decision.

Co-Authored-By: Claude Opus 4.8 <noreply@anthropic.com>
Claude-Session: https://claude.ai/code/session_013rPhqpSADpNhsdPp7eaHdk
</commit_message>
<xml_diff>
--- a/soa-toolkit/SOA_Words_MasterList_1.docx
+++ b/soa-toolkit/SOA_Words_MasterList_1.docx
@@ -24,7 +24,7 @@
     </w:p>
     <w:p>
       <w:r>
-        <w:t>163 modules · 148 linked to Advice Request Builder ticks · 15 standing rules · last synced 2026-07-07 (generator rev v190_38r)</w:t>
+        <w:t>164 modules · 148 linked to Advice Request Builder ticks · 16 standing rules · last synced 2026-07-07 (generator rev v190_38r)</w:t>
       </w:r>
     </w:p>
     <w:p>
@@ -290,6 +290,38 @@
       </w:pPr>
       <w:r>
         <w:t>Standard scope-out wording — each item appears only when that area is being scoped out of the advice.</w:t>
+      </w:r>
+    </w:p>
+    <w:p>
+      <w:pPr/>
+      <w:r>
+        <w:t>TTR goal — commence a TTR to supplement income (auto-added: existing client, retirement SOA)</w:t>
+      </w:r>
+    </w:p>
+    <w:p>
+      <w:pPr/>
+      <w:r>
+        <w:t>Standing rule   ·   Mode: Always-on (conditional)   ·   Scope gate: SOA = retirement AND existing client AND a TTR strategy is triggered from the advice request</w:t>
+      </w:r>
+    </w:p>
+    <w:p>
+      <w:pPr/>
+      <w:r>
+        <w:t>Trigger phrases: transition to retirement, ttr, supplement your income, commence a transition to retirement account</w:t>
+      </w:r>
+    </w:p>
+    <w:p>
+      <w:pPr/>
+      <w:r>
+        <w:t>Recommendation</w:t>
+      </w:r>
+    </w:p>
+    <w:p>
+      <w:pPr>
+        <w:pStyle w:val="ListBullet"/>
+      </w:pPr>
+      <w:r>
+        <w:t>During your recent review meeting, you advised that you would like to commence a Transition to Retirement account to help supplement your income. You are seeking our advice on the most appropriate way to proceed with this request.</w:t>
       </w:r>
     </w:p>
     <w:p>

</xml_diff>